<commit_message>
Add monthly close carryover settlement
</commit_message>
<xml_diff>
--- a/public/library/system-manual.docx
+++ b/public/library/system-manual.docx
@@ -1839,7 +1839,92 @@
         <w:pStyle w:val="Heading1"/>
       </w:pPr>
       <w:r>
-        <w:t>9. Git管理仕様</w:t>
+        <w:t>9. 月締め・繰越・精算仕様</w:t>
+      </w:r>
+    </w:p>
+    <w:p>
+      <w:pPr>
+        <w:pStyle w:val="ListBullet"/>
+      </w:pPr>
+      <w:r>
+        <w:rPr>
+          <w:rFonts w:ascii="Yu Gothic" w:hAnsi="Yu Gothic" w:eastAsia="Yu Gothic"/>
+        </w:rPr>
+        <w:t>履歴画面から対象月を選択して月締めできる。</w:t>
+      </w:r>
+    </w:p>
+    <w:p>
+      <w:pPr>
+        <w:pStyle w:val="ListBullet"/>
+      </w:pPr>
+      <w:r>
+        <w:rPr>
+          <w:rFonts w:ascii="Yu Gothic" w:hAnsi="Yu Gothic" w:eastAsia="Yu Gothic"/>
+        </w:rPr>
+        <w:t>月締め済み月以前の支出履歴は編集・削除できない。サーバー側でも保存・削除を拒否する。</w:t>
+      </w:r>
+    </w:p>
+    <w:p>
+      <w:pPr>
+        <w:pStyle w:val="ListBullet"/>
+      </w:pPr>
+      <w:r>
+        <w:rPr>
+          <w:rFonts w:ascii="Yu Gothic" w:hAnsi="Yu Gothic" w:eastAsia="Yu Gothic"/>
+        </w:rPr>
+        <w:t>月締め時点の精算額を次月へ繰り越し、次月の精算対象に含める。</w:t>
+      </w:r>
+    </w:p>
+    <w:p>
+      <w:pPr>
+        <w:pStyle w:val="ListBullet"/>
+      </w:pPr>
+      <w:r>
+        <w:rPr>
+          <w:rFonts w:ascii="Yu Gothic" w:hAnsi="Yu Gothic" w:eastAsia="Yu Gothic"/>
+        </w:rPr>
+        <w:t>精算ボタンから実際に精算した金額を入力すると、その月の精算額から差し引く。</w:t>
+      </w:r>
+    </w:p>
+    <w:p>
+      <w:pPr>
+        <w:pStyle w:val="ListBullet"/>
+      </w:pPr>
+      <w:r>
+        <w:rPr>
+          <w:rFonts w:ascii="Yu Gothic" w:hAnsi="Yu Gothic" w:eastAsia="Yu Gothic"/>
+        </w:rPr>
+        <w:t>精算額は「精算額○円」と表示し、2人割りで1円未満の半端が出る場合は「端数1円」を併記する。</w:t>
+      </w:r>
+    </w:p>
+    <w:p>
+      <w:pPr>
+        <w:pStyle w:val="ListBullet"/>
+      </w:pPr>
+      <w:r>
+        <w:rPr>
+          <w:rFonts w:ascii="Yu Gothic" w:hAnsi="Yu Gothic" w:eastAsia="Yu Gothic"/>
+        </w:rPr>
+        <w:t>カテゴリ削除時、締め済み履歴の category_id は変更しない。未締め履歴とショートカットのみ未分類にする。</w:t>
+      </w:r>
+    </w:p>
+    <w:p>
+      <w:pPr>
+        <w:pStyle w:val="ListBullet"/>
+      </w:pPr>
+      <w:r>
+        <w:rPr>
+          <w:rFonts w:ascii="Yu Gothic" w:hAnsi="Yu Gothic" w:eastAsia="Yu Gothic"/>
+        </w:rPr>
+        <w:t>月締め情報は monthly_closings.csv、繰越・精算入力は monthly_adjustments.csv に保存する。</w:t>
+      </w:r>
+    </w:p>
+    <w:p>
+      <w:pPr>
+        <w:pStyle w:val="Heading1"/>
+      </w:pPr>
+      <w:r>
+        <w:t>10. Git管理仕様</w:t>
       </w:r>
     </w:p>
     <w:tbl>
@@ -2133,7 +2218,7 @@
         <w:pStyle w:val="Heading1"/>
       </w:pPr>
       <w:r>
-        <w:t>10. AWS本番運用仕様</w:t>
+        <w:t>11. AWS本番運用仕様</w:t>
       </w:r>
     </w:p>
     <w:tbl>
@@ -2604,7 +2689,7 @@
         <w:pStyle w:val="Heading1"/>
       </w:pPr>
       <w:r>
-        <w:t>11. デプロイ・掃除手順</w:t>
+        <w:t>12. デプロイ・掃除手順</w:t>
       </w:r>
     </w:p>
     <w:tbl>
@@ -3086,7 +3171,7 @@
         <w:pStyle w:val="Heading1"/>
       </w:pPr>
       <w:r>
-        <w:t>12. 保守メモ</w:t>
+        <w:t>13. 保守メモ</w:t>
       </w:r>
     </w:p>
     <w:p>

</xml_diff>